<commit_message>
YHAAO-4344 add dept name and dept unique check
</commit_message>
<xml_diff>
--- a/src/src/main/webapp/portal/nurseSite/template.docx
+++ b/src/src/main/webapp/portal/nurseSite/template.docx
@@ -2,6 +2,38 @@
 <file path=word/document.xml><?xml version="1.0" encoding="utf-8"?>
 <w:document xmlns:wpc="http://schemas.microsoft.com/office/word/2010/wordprocessingCanvas" xmlns:cx="http://schemas.microsoft.com/office/drawing/2014/chartex" xmlns:cx1="http://schemas.microsoft.com/office/drawing/2015/9/8/chartex" xmlns:cx2="http://schemas.microsoft.com/office/drawing/2015/10/21/chartex" xmlns:cx3="http://schemas.microsoft.com/office/drawing/2016/5/9/chartex" xmlns:cx4="http://schemas.microsoft.com/office/drawing/2016/5/10/chartex" xmlns:cx5="http://schemas.microsoft.com/office/drawing/2016/5/11/chartex" xmlns:cx6="http://schemas.microsoft.com/office/drawing/2016/5/12/chartex" xmlns:cx7="http://schemas.microsoft.com/office/drawing/2016/5/13/chartex" xmlns:cx8="http://schemas.microsoft.com/office/drawing/2016/5/14/chartex" xmlns:mc="http://schemas.openxmlformats.org/markup-compatibility/2006" xmlns:aink="http://schemas.microsoft.com/office/drawing/2016/ink" xmlns:am3d="http://schemas.microsoft.com/office/drawing/2017/model3d" xmlns:o="urn:schemas-microsoft-com:office:office" xmlns:r="http://schemas.openxmlformats.org/officeDocument/2006/relationships" xmlns:m="http://schemas.openxmlformats.org/officeDocument/2006/math" xmlns:v="urn:schemas-microsoft-com:vml" xmlns:wp14="http://schemas.microsoft.com/office/word/2010/wordprocessingDrawing" xmlns:wp="http://schemas.openxmlformats.org/drawingml/2006/wordprocessingDrawing" xmlns:w10="urn:schemas-microsoft-com:office:word" xmlns:w="http://schemas.openxmlformats.org/wordprocessingml/2006/main" xmlns:w14="http://schemas.microsoft.com/office/word/2010/wordml" xmlns:w15="http://schemas.microsoft.com/office/word/2012/wordml" xmlns:w16cid="http://schemas.microsoft.com/office/word/2016/wordml/cid" xmlns:w16se="http://schemas.microsoft.com/office/word/2015/wordml/symex" xmlns:wpg="http://schemas.microsoft.com/office/word/2010/wordprocessingGroup" xmlns:wpi="http://schemas.microsoft.com/office/word/2010/wordprocessingInk" xmlns:wne="http://schemas.microsoft.com/office/word/2006/wordml" xmlns:wps="http://schemas.microsoft.com/office/word/2010/wordprocessingShape" mc:Ignorable="w14 w15 w16se w16cid wp14">
   <w:body>
+    <w:p>
+      <w:pPr>
+        <w:jc w:val="center"/>
+        <w:rPr>
+          <w:rStyle w:val="Strong"/>
+          <w:sz w:val="32"/>
+          <w:szCs w:val="32"/>
+        </w:rPr>
+      </w:pPr>
+      <w:bookmarkStart w:id="0" w:name="_GoBack"/>
+      <w:bookmarkEnd w:id="0"/>
+      <w:r>
+        <w:rPr>
+          <w:rStyle w:val="Strong"/>
+          <w:rFonts w:hint="eastAsia"/>
+          <w:sz w:val="32"/>
+          <w:szCs w:val="32"/>
+        </w:rPr>
+        <w:t>仪器设备功能完好检查登记</w:t>
+      </w:r>
+    </w:p>
+    <w:p>
+      <w:r>
+        <w:rPr>
+          <w:rFonts w:hint="eastAsia"/>
+        </w:rPr>
+        <w:t>所属科室</w:t>
+      </w:r>
+      <w:r>
+        <w:t>: {{dept}}</w:t>
+      </w:r>
+    </w:p>
     <w:tbl>
       <w:tblPr>
         <w:tblStyle w:val="TableGrid"/>
@@ -229,10 +261,7 @@
         </w:tc>
       </w:tr>
     </w:tbl>
-    <w:p>
-      <w:bookmarkStart w:id="0" w:name="_GoBack"/>
-      <w:bookmarkEnd w:id="0"/>
-    </w:p>
+    <w:p/>
     <w:sectPr>
       <w:pgSz w:w="15840" w:h="12240" w:orient="landscape"/>
       <w:pgMar w:top="1800" w:right="1440" w:bottom="1800" w:left="1440" w:header="720" w:footer="720" w:gutter="0"/>
@@ -687,6 +716,17 @@
       </w:tblBorders>
     </w:tblPr>
   </w:style>
+  <w:style w:type="character" w:styleId="Strong">
+    <w:name w:val="Strong"/>
+    <w:basedOn w:val="DefaultParagraphFont"/>
+    <w:uiPriority w:val="22"/>
+    <w:qFormat/>
+    <w:rsid w:val="00EB2AE8"/>
+    <w:rPr>
+      <w:b/>
+      <w:bCs/>
+    </w:rPr>
+  </w:style>
 </w:styles>
 </file>
 
@@ -990,7 +1030,7 @@
 </file>
 
 <file path=customXml/itemProps1.xml><?xml version="1.0" encoding="utf-8"?>
-<ds:datastoreItem xmlns:ds="http://schemas.openxmlformats.org/officeDocument/2006/customXml" ds:itemID="{3D41D769-A886-42FC-9961-D7D4C347499C}">
+<ds:datastoreItem xmlns:ds="http://schemas.openxmlformats.org/officeDocument/2006/customXml" ds:itemID="{58F4DD5C-0DCC-452D-87BC-F904703C545B}">
   <ds:schemaRefs>
     <ds:schemaRef ds:uri="http://schemas.openxmlformats.org/officeDocument/2006/bibliography"/>
   </ds:schemaRefs>

</xml_diff>

<commit_message>
YHAAO-4100 reverse asset table headers
</commit_message>
<xml_diff>
--- a/src/src/main/webapp/portal/nurseSite/template.docx
+++ b/src/src/main/webapp/portal/nurseSite/template.docx
@@ -11,8 +11,6 @@
           <w:szCs w:val="32"/>
         </w:rPr>
       </w:pPr>
-      <w:bookmarkStart w:id="0" w:name="_GoBack"/>
-      <w:bookmarkEnd w:id="0"/>
       <w:r>
         <w:rPr>
           <w:rStyle w:val="Strong"/>
@@ -64,13 +62,26 @@
             <w:vAlign w:val="center"/>
           </w:tcPr>
           <w:p>
+            <w:pPr>
+              <w:rPr>
+                <w:rFonts w:hint="eastAsia"/>
+              </w:rPr>
+            </w:pPr>
             <w:r>
               <w:rPr>
                 <w:rFonts w:hint="eastAsia"/>
                 <w:sz w:val="16"/>
                 <w:szCs w:val="16"/>
               </w:rPr>
-              <w:t>设备编号</w:t>
+              <w:t>设备</w:t>
+            </w:r>
+            <w:r>
+              <w:rPr>
+                <w:rFonts w:hint="eastAsia"/>
+                <w:sz w:val="16"/>
+                <w:szCs w:val="16"/>
+              </w:rPr>
+              <w:t>名称</w:t>
             </w:r>
           </w:p>
         </w:tc>
@@ -102,7 +113,7 @@
                 <w:sz w:val="16"/>
                 <w:szCs w:val="16"/>
               </w:rPr>
-              <w:t xml:space="preserve">                    </w:t>
+              <w:t xml:space="preserve">                   </w:t>
             </w:r>
             <w:r>
               <w:rPr>
@@ -126,8 +137,18 @@
                 <w:sz w:val="16"/>
                 <w:szCs w:val="16"/>
               </w:rPr>
-              <w:t>设备名称</w:t>
-            </w:r>
+              <w:t>设备</w:t>
+            </w:r>
+            <w:r>
+              <w:rPr>
+                <w:rFonts w:hint="eastAsia"/>
+                <w:sz w:val="16"/>
+                <w:szCs w:val="16"/>
+              </w:rPr>
+              <w:t>编号</w:t>
+            </w:r>
+            <w:bookmarkStart w:id="0" w:name="_GoBack"/>
+            <w:bookmarkEnd w:id="0"/>
           </w:p>
         </w:tc>
         <w:tc>
@@ -1030,7 +1051,7 @@
 </file>
 
 <file path=customXml/itemProps1.xml><?xml version="1.0" encoding="utf-8"?>
-<ds:datastoreItem xmlns:ds="http://schemas.openxmlformats.org/officeDocument/2006/customXml" ds:itemID="{58F4DD5C-0DCC-452D-87BC-F904703C545B}">
+<ds:datastoreItem xmlns:ds="http://schemas.openxmlformats.org/officeDocument/2006/customXml" ds:itemID="{7CE71CE7-E457-4EB5-A434-9B21742CBFE7}">
   <ds:schemaRefs>
     <ds:schemaRef ds:uri="http://schemas.openxmlformats.org/officeDocument/2006/bibliography"/>
   </ds:schemaRefs>

</xml_diff>